<commit_message>
Fix: Remove submodule references
</commit_message>
<xml_diff>
--- a/testlab-backend/src/documents/templates/word/test cahier de recette.docx
+++ b/testlab-backend/src/documents/templates/word/test cahier de recette.docx
@@ -857,6 +857,7 @@
       <w:pPr>
         <w:pStyle w:val="TableParagraph"/>
         <w:spacing w:after="0"/>
+        <w:ind w:left="0"/>
         <w:jc w:val="center"/>
         <w:rPr>
           <w:b w:val="1"/>
@@ -2697,7 +2698,51 @@
             <w:tcW w:w="2565" w:type="dxa"/>
             <w:tcMar/>
           </w:tcPr>
-          <w:p wp14:textId="36F17838">
+          <w:p wp14:textId="0307D90B">
+            <w:pPr>
+              <w:pStyle w:val="TableParagraph"/>
+              <w:spacing w:before="183"/>
+              <w:ind w:left="247"/>
+              <w:rPr>
+                <w:b w:val="0"/>
+                <w:bCs w:val="0"/>
+                <w:color w:val="auto"/>
+                <w:sz w:val="22"/>
+                <w:szCs w:val="22"/>
+              </w:rPr>
+            </w:pPr>
+            <w:r>
+              <w:rPr>
+                <w:b w:val="0"/>
+                <w:bCs w:val="0"/>
+                <w:color w:val="auto"/>
+                <w:sz w:val="22"/>
+                <w:szCs w:val="22"/>
+              </w:rPr>
+              <w:t>{{</w:t>
+            </w:r>
+            <w:r>
+              <w:rPr>
+                <w:b w:val="0"/>
+                <w:bCs w:val="0"/>
+                <w:color w:val="auto"/>
+                <w:sz w:val="22"/>
+                <w:szCs w:val="22"/>
+              </w:rPr>
+              <w:t>author</w:t>
+            </w:r>
+            <w:r>
+              <w:rPr>
+                <w:b w:val="0"/>
+                <w:bCs w:val="0"/>
+                <w:color w:val="auto"/>
+                <w:sz w:val="22"/>
+                <w:szCs w:val="22"/>
+              </w:rPr>
+              <w:t>}}</w:t>
+            </w:r>
+          </w:p>
+          <w:p wp14:textId="4BCCE964">
             <w:pPr>
               <w:pStyle w:val="TableParagraph"/>
               <w:spacing w:before="133"/>
@@ -2710,56 +2755,6 @@
                 <w:szCs w:val="21"/>
               </w:rPr>
             </w:pPr>
-            <w:r>
-              <w:rPr>
-                <w:b w:val="0"/>
-                <w:bCs w:val="0"/>
-                <w:color w:val="auto"/>
-                <w:sz w:val="21"/>
-                <w:szCs w:val="21"/>
-              </w:rPr>
-              <w:t>{</w:t>
-            </w:r>
-            <w:r>
-              <w:rPr>
-                <w:b w:val="0"/>
-                <w:bCs w:val="0"/>
-                <w:color w:val="auto"/>
-                <w:sz w:val="21"/>
-                <w:szCs w:val="21"/>
-              </w:rPr>
-              <w:t>{</w:t>
-            </w:r>
-            <w:r>
-              <w:rPr>
-                <w:b w:val="0"/>
-                <w:bCs w:val="0"/>
-                <w:color w:val="auto"/>
-                <w:sz w:val="21"/>
-                <w:szCs w:val="21"/>
-              </w:rPr>
-              <w:t>version</w:t>
-            </w:r>
-            <w:r>
-              <w:rPr>
-                <w:b w:val="0"/>
-                <w:bCs w:val="0"/>
-                <w:color w:val="auto"/>
-                <w:sz w:val="21"/>
-                <w:szCs w:val="21"/>
-              </w:rPr>
-              <w:t>}</w:t>
-            </w:r>
-            <w:r>
-              <w:rPr>
-                <w:b w:val="0"/>
-                <w:bCs w:val="0"/>
-                <w:color w:val="auto"/>
-                <w:sz w:val="21"/>
-                <w:szCs w:val="21"/>
-              </w:rPr>
-              <w:t>}</w:t>
-            </w:r>
           </w:p>
         </w:tc>
         <w:tc>
@@ -2983,11 +2978,12 @@
             <w:shd w:val="clear" w:color="auto" w:fill="FFFFFF" w:themeFill="background1"/>
             <w:tcMar/>
           </w:tcPr>
-          <w:p wp14:textId="4B22A010">
+          <w:p wp14:textId="247839D8">
             <w:pPr>
               <w:pStyle w:val="TableParagraph"/>
               <w:spacing w:before="148"/>
               <w:ind w:left="202"/>
+              <w:jc w:val="center"/>
               <w:rPr>
                 <w:b w:val="0"/>
                 <w:bCs w:val="0"/>
@@ -2996,6 +2992,30 @@
                 <w:szCs w:val="22"/>
               </w:rPr>
             </w:pPr>
+            <w:r>
+              <w:rPr>
+                <w:rFonts w:ascii="Segoe UI" w:hAnsi="Segoe UI" w:eastAsia="Segoe UI" w:cs="Segoe UI"/>
+                <w:b w:val="0"/>
+                <w:bCs w:val="0"/>
+                <w:i w:val="0"/>
+                <w:iCs w:val="0"/>
+                <w:caps w:val="0"/>
+                <w:smallCaps w:val="0"/>
+                <w:noProof w:val="0"/>
+                <w:color w:val="auto"/>
+                <w:sz w:val="22"/>
+                <w:szCs w:val="22"/>
+                <w:lang w:val="fr-FR"/>
+              </w:rPr>
+              <w:t>{{#approvals}}</w:t>
+            </w:r>
+            <w:r>
+              <w:rPr>
+                <w:noProof w:val="0"/>
+                <w:lang w:val="fr-FR"/>
+              </w:rPr>
+              <w:t xml:space="preserve"> </w:t>
+            </w:r>
             <w:r>
               <w:rPr>
                 <w:b/>
@@ -3805,17 +3825,15 @@
             <w:shd w:val="clear" w:color="auto" w:fill="FFFFFF" w:themeFill="background1"/>
             <w:tcMar/>
           </w:tcPr>
-          <w:p wp14:textId="4FE0EB8B">
+          <w:p wp14:textId="187245FE">
             <w:pPr>
               <w:pStyle w:val="TableParagraph"/>
               <w:spacing w:before="148"/>
               <w:ind w:left="206"/>
-              <w:rPr>
-                <w:b w:val="0"/>
-                <w:bCs w:val="0"/>
-                <w:color w:val="auto"/>
-                <w:sz w:val="22"/>
-                <w:szCs w:val="22"/>
+              <w:jc w:val="center"/>
+              <w:rPr>
+                <w:noProof w:val="0"/>
+                <w:lang w:val="fr-FR"/>
               </w:rPr>
             </w:pPr>
             <w:r>
@@ -4143,6 +4161,74 @@
               </w:rPr>
               <w:t>}</w:t>
             </w:r>
+            <w:r>
+              <w:rPr>
+                <w:rFonts w:ascii="Segoe UI" w:hAnsi="Segoe UI" w:eastAsia="Segoe UI" w:cs="Segoe UI"/>
+                <w:b w:val="0"/>
+                <w:bCs w:val="0"/>
+                <w:i w:val="0"/>
+                <w:iCs w:val="0"/>
+                <w:caps w:val="0"/>
+                <w:smallCaps w:val="0"/>
+                <w:noProof w:val="0"/>
+                <w:color w:val="BFBFBF" w:themeColor="background1" w:themeTint="FF" w:themeShade="BF"/>
+                <w:sz w:val="19"/>
+                <w:szCs w:val="19"/>
+                <w:lang w:val="fr-FR"/>
+              </w:rPr>
+              <w:t xml:space="preserve"> </w:t>
+            </w:r>
+            <w:r>
+              <w:rPr>
+                <w:rFonts w:ascii="Segoe UI" w:hAnsi="Segoe UI" w:eastAsia="Segoe UI" w:cs="Segoe UI"/>
+                <w:b w:val="0"/>
+                <w:bCs w:val="0"/>
+                <w:i w:val="0"/>
+                <w:iCs w:val="0"/>
+                <w:caps w:val="0"/>
+                <w:smallCaps w:val="0"/>
+                <w:noProof w:val="0"/>
+                <w:color w:val="auto"/>
+                <w:sz w:val="22"/>
+                <w:szCs w:val="22"/>
+                <w:lang w:val="fr-FR"/>
+              </w:rPr>
+              <w:t>{{/</w:t>
+            </w:r>
+            <w:r>
+              <w:rPr>
+                <w:rFonts w:ascii="Segoe UI" w:hAnsi="Segoe UI" w:eastAsia="Segoe UI" w:cs="Segoe UI"/>
+                <w:b w:val="0"/>
+                <w:bCs w:val="0"/>
+                <w:i w:val="0"/>
+                <w:iCs w:val="0"/>
+                <w:caps w:val="0"/>
+                <w:smallCaps w:val="0"/>
+                <w:noProof w:val="0"/>
+                <w:color w:val="auto"/>
+                <w:sz w:val="22"/>
+                <w:szCs w:val="22"/>
+                <w:lang w:val="fr-FR"/>
+              </w:rPr>
+              <w:t>approvals</w:t>
+            </w:r>
+            <w:r>
+              <w:rPr>
+                <w:rFonts w:ascii="Segoe UI" w:hAnsi="Segoe UI" w:eastAsia="Segoe UI" w:cs="Segoe UI"/>
+                <w:b w:val="0"/>
+                <w:bCs w:val="0"/>
+                <w:i w:val="0"/>
+                <w:iCs w:val="0"/>
+                <w:caps w:val="0"/>
+                <w:smallCaps w:val="0"/>
+                <w:noProof w:val="0"/>
+                <w:color w:val="auto"/>
+                <w:sz w:val="22"/>
+                <w:szCs w:val="22"/>
+                <w:lang w:val="fr-FR"/>
+              </w:rPr>
+              <w:t>}}</w:t>
+            </w:r>
           </w:p>
         </w:tc>
       </w:tr>
@@ -5539,6 +5625,7 @@
               <w:pStyle w:val="TableParagraph"/>
               <w:spacing w:before="133"/>
               <w:ind w:left="202"/>
+              <w:jc w:val="center"/>
               <w:rPr>
                 <w:b w:val="0"/>
                 <w:bCs w:val="0"/>
@@ -5566,6 +5653,46 @@
                 <w:szCs w:val="21"/>
               </w:rPr>
               <w:t>#steps</w:t>
+            </w:r>
+            <w:r>
+              <w:rPr>
+                <w:b w:val="0"/>
+                <w:bCs w:val="0"/>
+                <w:color w:val="auto"/>
+                <w:sz w:val="21"/>
+                <w:szCs w:val="21"/>
+              </w:rPr>
+              <w:t>}}</w:t>
+            </w:r>
+            <w:r>
+              <w:rPr>
+                <w:b w:val="0"/>
+                <w:bCs w:val="0"/>
+                <w:color w:val="auto"/>
+                <w:sz w:val="21"/>
+                <w:szCs w:val="21"/>
+              </w:rPr>
+              <w:t>{</w:t>
+            </w:r>
+            <w:r>
+              <w:rPr>
+                <w:b w:val="0"/>
+                <w:bCs w:val="0"/>
+                <w:color w:val="auto"/>
+                <w:sz w:val="21"/>
+                <w:szCs w:val="21"/>
+              </w:rPr>
+              <w:t>{</w:t>
+            </w:r>
+            <w:r>
+              <w:rPr>
+                <w:b w:val="0"/>
+                <w:bCs w:val="0"/>
+                <w:color w:val="auto"/>
+                <w:sz w:val="21"/>
+                <w:szCs w:val="21"/>
+              </w:rPr>
+              <w:t>order</w:t>
             </w:r>
             <w:r>
               <w:rPr>
@@ -5619,27 +5746,7 @@
                 <w:sz w:val="21"/>
                 <w:szCs w:val="21"/>
               </w:rPr>
-              <w:t>{{</w:t>
-            </w:r>
-            <w:r>
-              <w:rPr>
-                <w:b w:val="0"/>
-                <w:bCs w:val="0"/>
-                <w:color w:val="auto"/>
-                <w:sz w:val="21"/>
-                <w:szCs w:val="21"/>
-              </w:rPr>
-              <w:t>order. action → expectedResult</w:t>
-            </w:r>
-            <w:r>
-              <w:rPr>
-                <w:b w:val="0"/>
-                <w:bCs w:val="0"/>
-                <w:color w:val="auto"/>
-                <w:sz w:val="21"/>
-                <w:szCs w:val="21"/>
-              </w:rPr>
-              <w:t>}}</w:t>
+              <w:t>{{action}}</w:t>
             </w:r>
           </w:p>
           <w:p>
@@ -5898,6 +6005,7 @@
             <w:tcW w:w="4935" w:type="dxa"/>
             <w:shd w:val="clear" w:color="auto" w:fill="F6F5F2"/>
             <w:tcMar/>
+            <w:vAlign w:val="top"/>
           </w:tcPr>
           <w:p>
             <w:pPr>
@@ -5925,6 +6033,7 @@
           <w:p>
             <w:pPr>
               <w:pStyle w:val="TableParagraph"/>
+              <w:jc w:val="center"/>
               <w:rPr>
                 <w:b w:val="1"/>
                 <w:bCs w:val="1"/>
@@ -6150,9 +6259,9 @@
         </w:tc>
       </w:tr>
     </w:tbl>
-    <w:p>
-      <w:pPr>
-        <w:pStyle w:val="Heading1"/>
+    <w:p xmlns:wp14="http://schemas.microsoft.com/office/word/2010/wordml" wp14:textId="10580F88">
+      <w:pPr>
+        <w:pStyle w:val="Normal"/>
         <w:tabs>
           <w:tab w:val="left" w:leader="none" w:pos="461"/>
         </w:tabs>
@@ -6161,15 +6270,6 @@
         <w:jc w:val="left"/>
         <w:rPr>
           <w:color w:val="1F4E78"/>
-        </w:rPr>
-      </w:pPr>
-    </w:p>
-    <w:p xmlns:wp14="http://schemas.microsoft.com/office/word/2010/wordml" wp14:textId="77777777">
-      <w:pPr>
-        <w:spacing w:after="0" w:line="240" w:lineRule="auto"/>
-        <w:rPr>
-          <w:b/>
-          <w:sz w:val="5"/>
         </w:rPr>
         <w:sectPr>
           <w:pgSz w:w="11920" w:h="16840" w:orient="portrait"/>

</xml_diff>